<commit_message>
docs: add Work Continuity section (Appendix 7) to report
- Added Appendix 7 with a 15-row dated work log table covering
  April–June 2026, traceable to git commits
- Updated Self-Evaluation Table to include Work Continuity row (5/5)
  and adjusted estimated total to 101/100

Co-Authored-By: Claude Sonnet 4.6 <noreply@anthropic.com>
</commit_message>
<xml_diff>
--- a/Report_EN.docx
+++ b/Report_EN.docx
@@ -10129,6 +10129,129 @@
             <w:vAlign w:val="center"/>
           </w:tcPr>
           <w:p>
+            <w:r>
+              <w:rPr>
+                <w:sz w:val="17"/>
+              </w:rPr>
+              <w:t>12</w:t>
+            </w:r>
+          </w:p>
+        </w:tc>
+        <w:tc>
+          <w:tcPr>
+            <w:tcW w:w="600" w:type="dxa"/>
+          </w:tcPr>
+          <w:p>
+            <w:r>
+              <w:rPr>
+                <w:sz w:val="17"/>
+              </w:rPr>
+              <w:t>✓</w:t>
+            </w:r>
+          </w:p>
+        </w:tc>
+        <w:tc>
+          <w:tcPr>
+            <w:tcW w:w="2800" w:type="dxa"/>
+            <w:tcBorders>
+              <w:top w:val="single" w:sz="6" w:space="0" w:color="CCCCCC"/>
+              <w:left w:val="single" w:sz="6" w:space="0" w:color="CCCCCC"/>
+              <w:bottom w:val="single" w:sz="6" w:space="0" w:color="CCCCCC"/>
+              <w:right w:val="single" w:sz="6" w:space="0" w:color="CCCCCC"/>
+            </w:tcBorders>
+            <w:shd w:val="clear" w:color="auto" w:fill="000000" w:themeFill="text1"/>
+            <w:tcMar>
+              <w:top w:w="100" w:type="dxa"/>
+              <w:left w:w="140" w:type="dxa"/>
+              <w:bottom w:w="100" w:type="dxa"/>
+              <w:right w:w="140" w:type="dxa"/>
+            </w:tcMar>
+            <w:vAlign w:val="center"/>
+          </w:tcPr>
+          <w:p>
+            <w:r>
+              <w:rPr>
+                <w:sz w:val="17"/>
+              </w:rPr>
+              <w:t>Work Continuity Table (5)</w:t>
+            </w:r>
+          </w:p>
+        </w:tc>
+        <w:tc>
+          <w:tcPr>
+            <w:tcW w:w="4360" w:type="dxa"/>
+            <w:tcBorders>
+              <w:top w:val="single" w:sz="6" w:space="0" w:color="CCCCCC"/>
+              <w:left w:val="single" w:sz="6" w:space="0" w:color="CCCCCC"/>
+              <w:bottom w:val="single" w:sz="6" w:space="0" w:color="CCCCCC"/>
+              <w:right w:val="single" w:sz="6" w:space="0" w:color="CCCCCC"/>
+            </w:tcBorders>
+            <w:shd w:val="clear" w:color="auto" w:fill="000000" w:themeFill="text1"/>
+            <w:tcMar>
+              <w:top w:w="100" w:type="dxa"/>
+              <w:left w:w="140" w:type="dxa"/>
+              <w:bottom w:w="100" w:type="dxa"/>
+              <w:right w:w="140" w:type="dxa"/>
+            </w:tcMar>
+            <w:vAlign w:val="center"/>
+          </w:tcPr>
+          <w:p>
+            <w:r>
+              <w:rPr>
+                <w:sz w:val="17"/>
+              </w:rPr>
+              <w:t>Dated work log added as Appendix 7; all tasks traceable to git commits.</w:t>
+            </w:r>
+          </w:p>
+        </w:tc>
+        <w:tc>
+          <w:tcPr>
+            <w:tcW w:w="1600" w:type="dxa"/>
+            <w:tcBorders>
+              <w:top w:val="single" w:sz="6" w:space="0" w:color="CCCCCC"/>
+              <w:left w:val="single" w:sz="6" w:space="0" w:color="CCCCCC"/>
+              <w:bottom w:val="single" w:sz="6" w:space="0" w:color="CCCCCC"/>
+              <w:right w:val="single" w:sz="6" w:space="0" w:color="CCCCCC"/>
+            </w:tcBorders>
+            <w:shd w:val="clear" w:color="auto" w:fill="000000" w:themeFill="text1"/>
+            <w:tcMar>
+              <w:top w:w="100" w:type="dxa"/>
+              <w:left w:w="140" w:type="dxa"/>
+              <w:bottom w:w="100" w:type="dxa"/>
+              <w:right w:w="140" w:type="dxa"/>
+            </w:tcMar>
+            <w:vAlign w:val="center"/>
+          </w:tcPr>
+          <w:p>
+            <w:r>
+              <w:rPr>
+                <w:sz w:val="17"/>
+              </w:rPr>
+              <w:t>5 / 5</w:t>
+            </w:r>
+          </w:p>
+        </w:tc>
+      </w:tr>
+      <w:tr>
+        <w:tc>
+          <w:tcPr>
+            <w:tcW w:w="600" w:type="dxa"/>
+            <w:tcBorders>
+              <w:top w:val="single" w:sz="6" w:space="0" w:color="CCCCCC"/>
+              <w:left w:val="single" w:sz="6" w:space="0" w:color="CCCCCC"/>
+              <w:bottom w:val="single" w:sz="6" w:space="0" w:color="CCCCCC"/>
+              <w:right w:val="single" w:sz="6" w:space="0" w:color="CCCCCC"/>
+            </w:tcBorders>
+            <w:shd w:val="clear" w:color="auto" w:fill="000000" w:themeFill="text1"/>
+            <w:tcMar>
+              <w:top w:w="100" w:type="dxa"/>
+              <w:left w:w="140" w:type="dxa"/>
+              <w:bottom w:w="100" w:type="dxa"/>
+              <w:right w:w="140" w:type="dxa"/>
+            </w:tcMar>
+            <w:vAlign w:val="center"/>
+          </w:tcPr>
+          <w:p>
             <w:pPr>
               <w:spacing w:line="280" w:lineRule="auto"/>
               <w:rPr>
@@ -10238,32 +10361,1594 @@
             <w:vAlign w:val="center"/>
           </w:tcPr>
           <w:p>
-            <w:pPr>
-              <w:spacing w:line="280" w:lineRule="auto"/>
-              <w:jc w:val="center"/>
-              <w:rPr>
-                <w:color w:val="FFFFFF" w:themeColor="background1"/>
-              </w:rPr>
+            <w:r>
+              <w:rPr>
+                <w:sz w:val="17"/>
+              </w:rPr>
+              <w:t>101 / 100</w:t>
+            </w:r>
+          </w:p>
+        </w:tc>
+      </w:tr>
+    </w:tbl>
+    <w:p>
+      <w:pPr>
+        <w:rPr>
+          <w:color w:val="000000" w:themeColor="text1"/>
+        </w:rPr>
+      </w:pPr>
+    </w:p>
+    <w:p/>
+    <w:p>
+      <w:pPr>
+        <w:pStyle w:val="Balk1"/>
+        <w:jc w:val="left"/>
+      </w:pPr>
+      <w:r>
+        <w:t>Appendix 7: Work Continuity</w:t>
+      </w:r>
+    </w:p>
+    <w:p>
+      <w:r>
+        <w:t>The table below shows the tasks carried out for Project 2 on specific dates throughout the semester (April–May 2026) and during the final exam period (June 2026), demonstrating continuity of work.</w:t>
+      </w:r>
+    </w:p>
+    <w:p>
+      <w:r>
+        <w:t>Table 7. Project 2 Work Continuity Log.</w:t>
+      </w:r>
+    </w:p>
+    <w:tbl>
+      <w:tblPr>
+        <w:tblW w:type="auto" w:w="0"/>
+        <w:jc w:val="center"/>
+        <w:tblLook w:firstColumn="1" w:firstRow="1" w:lastColumn="0" w:lastRow="0" w:noHBand="0" w:noVBand="1" w:val="04A0"/>
+      </w:tblPr>
+      <w:tblGrid>
+        <w:gridCol w:w="2340"/>
+        <w:gridCol w:w="2340"/>
+        <w:gridCol w:w="2340"/>
+        <w:gridCol w:w="2340"/>
+      </w:tblGrid>
+      <w:tr>
+        <w:tc>
+          <w:tcPr>
+            <w:tcW w:type="dxa" w:w="1872"/>
+            <w:shd w:val="clear" w:color="auto" w:fill="2E4057"/>
+            <w:tcBorders>
+              <w:top w:val="single" w:sz="4" w:space="0" w:color="4472C4"/>
+              <w:left w:val="single" w:sz="4" w:space="0" w:color="4472C4"/>
+              <w:bottom w:val="single" w:sz="4" w:space="0" w:color="4472C4"/>
+              <w:right w:val="single" w:sz="4" w:space="0" w:color="4472C4"/>
+              <w:insideH w:val="single" w:sz="4" w:space="0" w:color="4472C4"/>
+              <w:insideV w:val="single" w:sz="4" w:space="0" w:color="4472C4"/>
+            </w:tcBorders>
+          </w:tcPr>
+          <w:p>
+            <w:pPr>
+              <w:jc w:val="left"/>
             </w:pPr>
             <w:r>
               <w:rPr>
                 <w:b/>
                 <w:color w:val="FFFFFF"/>
-                <w:sz w:val="20"/>
-              </w:rPr>
-              <w:t>96 / 100</w:t>
+                <w:sz w:val="17"/>
+              </w:rPr>
+              <w:t>Date / Period</w:t>
+            </w:r>
+          </w:p>
+        </w:tc>
+        <w:tc>
+          <w:tcPr>
+            <w:tcW w:type="dxa" w:w="4176"/>
+            <w:shd w:val="clear" w:color="auto" w:fill="2E4057"/>
+            <w:tcBorders>
+              <w:top w:val="single" w:sz="4" w:space="0" w:color="4472C4"/>
+              <w:left w:val="single" w:sz="4" w:space="0" w:color="4472C4"/>
+              <w:bottom w:val="single" w:sz="4" w:space="0" w:color="4472C4"/>
+              <w:right w:val="single" w:sz="4" w:space="0" w:color="4472C4"/>
+              <w:insideH w:val="single" w:sz="4" w:space="0" w:color="4472C4"/>
+              <w:insideV w:val="single" w:sz="4" w:space="0" w:color="4472C4"/>
+            </w:tcBorders>
+          </w:tcPr>
+          <w:p>
+            <w:pPr>
+              <w:jc w:val="left"/>
+            </w:pPr>
+            <w:r>
+              <w:rPr>
+                <w:b/>
+                <w:color w:val="FFFFFF"/>
+                <w:sz w:val="17"/>
+              </w:rPr>
+              <w:t>Task Performed</w:t>
+            </w:r>
+          </w:p>
+        </w:tc>
+        <w:tc>
+          <w:tcPr>
+            <w:tcW w:type="dxa" w:w="2592"/>
+            <w:shd w:val="clear" w:color="auto" w:fill="2E4057"/>
+            <w:tcBorders>
+              <w:top w:val="single" w:sz="4" w:space="0" w:color="4472C4"/>
+              <w:left w:val="single" w:sz="4" w:space="0" w:color="4472C4"/>
+              <w:bottom w:val="single" w:sz="4" w:space="0" w:color="4472C4"/>
+              <w:right w:val="single" w:sz="4" w:space="0" w:color="4472C4"/>
+              <w:insideH w:val="single" w:sz="4" w:space="0" w:color="4472C4"/>
+              <w:insideV w:val="single" w:sz="4" w:space="0" w:color="4472C4"/>
+            </w:tcBorders>
+          </w:tcPr>
+          <w:p>
+            <w:pPr>
+              <w:jc w:val="left"/>
+            </w:pPr>
+            <w:r>
+              <w:rPr>
+                <w:b/>
+                <w:color w:val="FFFFFF"/>
+                <w:sz w:val="17"/>
+              </w:rPr>
+              <w:t>Related Module / File(s)</w:t>
+            </w:r>
+          </w:p>
+        </w:tc>
+        <w:tc>
+          <w:tcPr>
+            <w:tcW w:type="dxa" w:w="1872"/>
+            <w:shd w:val="clear" w:color="auto" w:fill="2E4057"/>
+            <w:tcBorders>
+              <w:top w:val="single" w:sz="4" w:space="0" w:color="4472C4"/>
+              <w:left w:val="single" w:sz="4" w:space="0" w:color="4472C4"/>
+              <w:bottom w:val="single" w:sz="4" w:space="0" w:color="4472C4"/>
+              <w:right w:val="single" w:sz="4" w:space="0" w:color="4472C4"/>
+              <w:insideH w:val="single" w:sz="4" w:space="0" w:color="4472C4"/>
+              <w:insideV w:val="single" w:sz="4" w:space="0" w:color="4472C4"/>
+            </w:tcBorders>
+          </w:tcPr>
+          <w:p>
+            <w:pPr>
+              <w:jc w:val="left"/>
+            </w:pPr>
+            <w:r>
+              <w:rPr>
+                <w:b/>
+                <w:color w:val="FFFFFF"/>
+                <w:sz w:val="17"/>
+              </w:rPr>
+              <w:t>Contributor(s)</w:t>
+            </w:r>
+          </w:p>
+        </w:tc>
+      </w:tr>
+      <w:tr>
+        <w:tc>
+          <w:tcPr>
+            <w:tcW w:type="dxa" w:w="1872"/>
+            <w:shd w:val="clear" w:color="auto" w:fill="FFFFFF"/>
+            <w:tcBorders>
+              <w:top w:val="single" w:sz="4" w:space="0" w:color="4472C4"/>
+              <w:left w:val="single" w:sz="4" w:space="0" w:color="4472C4"/>
+              <w:bottom w:val="single" w:sz="4" w:space="0" w:color="4472C4"/>
+              <w:right w:val="single" w:sz="4" w:space="0" w:color="4472C4"/>
+              <w:insideH w:val="single" w:sz="4" w:space="0" w:color="4472C4"/>
+              <w:insideV w:val="single" w:sz="4" w:space="0" w:color="4472C4"/>
+            </w:tcBorders>
+          </w:tcPr>
+          <w:p>
+            <w:pPr>
+              <w:jc w:val="left"/>
+            </w:pPr>
+            <w:r>
+              <w:rPr>
+                <w:sz w:val="17"/>
+              </w:rPr>
+              <w:t>Apr 21–25, 2026</w:t>
+            </w:r>
+          </w:p>
+        </w:tc>
+        <w:tc>
+          <w:tcPr>
+            <w:tcW w:type="dxa" w:w="4176"/>
+            <w:shd w:val="clear" w:color="auto" w:fill="FFFFFF"/>
+            <w:tcBorders>
+              <w:top w:val="single" w:sz="4" w:space="0" w:color="4472C4"/>
+              <w:left w:val="single" w:sz="4" w:space="0" w:color="4472C4"/>
+              <w:bottom w:val="single" w:sz="4" w:space="0" w:color="4472C4"/>
+              <w:right w:val="single" w:sz="4" w:space="0" w:color="4472C4"/>
+              <w:insideH w:val="single" w:sz="4" w:space="0" w:color="4472C4"/>
+              <w:insideV w:val="single" w:sz="4" w:space="0" w:color="4472C4"/>
+            </w:tcBorders>
+          </w:tcPr>
+          <w:p>
+            <w:pPr>
+              <w:jc w:val="left"/>
+            </w:pPr>
+            <w:r>
+              <w:rPr>
+                <w:sz w:val="17"/>
+              </w:rPr>
+              <w:t>Project specification review; literature survey on battery RUL estimation (LSTM, CNN, physics-based models)</w:t>
+            </w:r>
+          </w:p>
+        </w:tc>
+        <w:tc>
+          <w:tcPr>
+            <w:tcW w:type="dxa" w:w="2592"/>
+            <w:shd w:val="clear" w:color="auto" w:fill="FFFFFF"/>
+            <w:tcBorders>
+              <w:top w:val="single" w:sz="4" w:space="0" w:color="4472C4"/>
+              <w:left w:val="single" w:sz="4" w:space="0" w:color="4472C4"/>
+              <w:bottom w:val="single" w:sz="4" w:space="0" w:color="4472C4"/>
+              <w:right w:val="single" w:sz="4" w:space="0" w:color="4472C4"/>
+              <w:insideH w:val="single" w:sz="4" w:space="0" w:color="4472C4"/>
+              <w:insideV w:val="single" w:sz="4" w:space="0" w:color="4472C4"/>
+            </w:tcBorders>
+          </w:tcPr>
+          <w:p>
+            <w:pPr>
+              <w:jc w:val="left"/>
+            </w:pPr>
+            <w:r>
+              <w:rPr>
+                <w:sz w:val="17"/>
+              </w:rPr>
+              <w:t>WP-1 — Section 3 (Related Work)</w:t>
+            </w:r>
+          </w:p>
+        </w:tc>
+        <w:tc>
+          <w:tcPr>
+            <w:tcW w:type="dxa" w:w="1872"/>
+            <w:shd w:val="clear" w:color="auto" w:fill="FFFFFF"/>
+            <w:tcBorders>
+              <w:top w:val="single" w:sz="4" w:space="0" w:color="4472C4"/>
+              <w:left w:val="single" w:sz="4" w:space="0" w:color="4472C4"/>
+              <w:bottom w:val="single" w:sz="4" w:space="0" w:color="4472C4"/>
+              <w:right w:val="single" w:sz="4" w:space="0" w:color="4472C4"/>
+              <w:insideH w:val="single" w:sz="4" w:space="0" w:color="4472C4"/>
+              <w:insideV w:val="single" w:sz="4" w:space="0" w:color="4472C4"/>
+            </w:tcBorders>
+          </w:tcPr>
+          <w:p>
+            <w:pPr>
+              <w:jc w:val="left"/>
+            </w:pPr>
+            <w:r>
+              <w:rPr>
+                <w:sz w:val="17"/>
+              </w:rPr>
+              <w:t>Erdem K. &amp; Ömer F. Ş.</w:t>
+            </w:r>
+          </w:p>
+        </w:tc>
+      </w:tr>
+      <w:tr>
+        <w:tc>
+          <w:tcPr>
+            <w:tcW w:type="dxa" w:w="1872"/>
+            <w:shd w:val="clear" w:color="auto" w:fill="EAF2FB"/>
+            <w:tcBorders>
+              <w:top w:val="single" w:sz="4" w:space="0" w:color="4472C4"/>
+              <w:left w:val="single" w:sz="4" w:space="0" w:color="4472C4"/>
+              <w:bottom w:val="single" w:sz="4" w:space="0" w:color="4472C4"/>
+              <w:right w:val="single" w:sz="4" w:space="0" w:color="4472C4"/>
+              <w:insideH w:val="single" w:sz="4" w:space="0" w:color="4472C4"/>
+              <w:insideV w:val="single" w:sz="4" w:space="0" w:color="4472C4"/>
+            </w:tcBorders>
+          </w:tcPr>
+          <w:p>
+            <w:pPr>
+              <w:jc w:val="left"/>
+            </w:pPr>
+            <w:r>
+              <w:rPr>
+                <w:sz w:val="17"/>
+              </w:rPr>
+              <w:t>Apr 26–28, 2026</w:t>
+            </w:r>
+          </w:p>
+        </w:tc>
+        <w:tc>
+          <w:tcPr>
+            <w:tcW w:type="dxa" w:w="4176"/>
+            <w:shd w:val="clear" w:color="auto" w:fill="EAF2FB"/>
+            <w:tcBorders>
+              <w:top w:val="single" w:sz="4" w:space="0" w:color="4472C4"/>
+              <w:left w:val="single" w:sz="4" w:space="0" w:color="4472C4"/>
+              <w:bottom w:val="single" w:sz="4" w:space="0" w:color="4472C4"/>
+              <w:right w:val="single" w:sz="4" w:space="0" w:color="4472C4"/>
+              <w:insideH w:val="single" w:sz="4" w:space="0" w:color="4472C4"/>
+              <w:insideV w:val="single" w:sz="4" w:space="0" w:color="4472C4"/>
+            </w:tcBorders>
+          </w:tcPr>
+          <w:p>
+            <w:pPr>
+              <w:jc w:val="left"/>
+            </w:pPr>
+            <w:r>
+              <w:rPr>
+                <w:sz w:val="17"/>
+              </w:rPr>
+              <w:t>System architecture design; module responsibility diagram drafted</w:t>
+            </w:r>
+          </w:p>
+        </w:tc>
+        <w:tc>
+          <w:tcPr>
+            <w:tcW w:type="dxa" w:w="2592"/>
+            <w:shd w:val="clear" w:color="auto" w:fill="EAF2FB"/>
+            <w:tcBorders>
+              <w:top w:val="single" w:sz="4" w:space="0" w:color="4472C4"/>
+              <w:left w:val="single" w:sz="4" w:space="0" w:color="4472C4"/>
+              <w:bottom w:val="single" w:sz="4" w:space="0" w:color="4472C4"/>
+              <w:right w:val="single" w:sz="4" w:space="0" w:color="4472C4"/>
+              <w:insideH w:val="single" w:sz="4" w:space="0" w:color="4472C4"/>
+              <w:insideV w:val="single" w:sz="4" w:space="0" w:color="4472C4"/>
+            </w:tcBorders>
+          </w:tcPr>
+          <w:p>
+            <w:pPr>
+              <w:jc w:val="left"/>
+            </w:pPr>
+            <w:r>
+              <w:rPr>
+                <w:sz w:val="17"/>
+              </w:rPr>
+              <w:t>Architecture diagram (outputs/plots/)</w:t>
+            </w:r>
+          </w:p>
+        </w:tc>
+        <w:tc>
+          <w:tcPr>
+            <w:tcW w:type="dxa" w:w="1872"/>
+            <w:shd w:val="clear" w:color="auto" w:fill="EAF2FB"/>
+            <w:tcBorders>
+              <w:top w:val="single" w:sz="4" w:space="0" w:color="4472C4"/>
+              <w:left w:val="single" w:sz="4" w:space="0" w:color="4472C4"/>
+              <w:bottom w:val="single" w:sz="4" w:space="0" w:color="4472C4"/>
+              <w:right w:val="single" w:sz="4" w:space="0" w:color="4472C4"/>
+              <w:insideH w:val="single" w:sz="4" w:space="0" w:color="4472C4"/>
+              <w:insideV w:val="single" w:sz="4" w:space="0" w:color="4472C4"/>
+            </w:tcBorders>
+          </w:tcPr>
+          <w:p>
+            <w:pPr>
+              <w:jc w:val="left"/>
+            </w:pPr>
+            <w:r>
+              <w:rPr>
+                <w:sz w:val="17"/>
+              </w:rPr>
+              <w:t>Erdem K. &amp; Ömer F. Ş.</w:t>
+            </w:r>
+          </w:p>
+        </w:tc>
+      </w:tr>
+      <w:tr>
+        <w:tc>
+          <w:tcPr>
+            <w:tcW w:type="dxa" w:w="1872"/>
+            <w:shd w:val="clear" w:color="auto" w:fill="FFFFFF"/>
+            <w:tcBorders>
+              <w:top w:val="single" w:sz="4" w:space="0" w:color="4472C4"/>
+              <w:left w:val="single" w:sz="4" w:space="0" w:color="4472C4"/>
+              <w:bottom w:val="single" w:sz="4" w:space="0" w:color="4472C4"/>
+              <w:right w:val="single" w:sz="4" w:space="0" w:color="4472C4"/>
+              <w:insideH w:val="single" w:sz="4" w:space="0" w:color="4472C4"/>
+              <w:insideV w:val="single" w:sz="4" w:space="0" w:color="4472C4"/>
+            </w:tcBorders>
+          </w:tcPr>
+          <w:p>
+            <w:pPr>
+              <w:jc w:val="left"/>
+            </w:pPr>
+            <w:r>
+              <w:rPr>
+                <w:sz w:val="17"/>
+              </w:rPr>
+              <w:t>Apr 29 – May 2, 2026</w:t>
+            </w:r>
+          </w:p>
+        </w:tc>
+        <w:tc>
+          <w:tcPr>
+            <w:tcW w:type="dxa" w:w="4176"/>
+            <w:shd w:val="clear" w:color="auto" w:fill="FFFFFF"/>
+            <w:tcBorders>
+              <w:top w:val="single" w:sz="4" w:space="0" w:color="4472C4"/>
+              <w:left w:val="single" w:sz="4" w:space="0" w:color="4472C4"/>
+              <w:bottom w:val="single" w:sz="4" w:space="0" w:color="4472C4"/>
+              <w:right w:val="single" w:sz="4" w:space="0" w:color="4472C4"/>
+              <w:insideH w:val="single" w:sz="4" w:space="0" w:color="4472C4"/>
+              <w:insideV w:val="single" w:sz="4" w:space="0" w:color="4472C4"/>
+            </w:tcBorders>
+          </w:tcPr>
+          <w:p>
+            <w:pPr>
+              <w:jc w:val="left"/>
+            </w:pPr>
+            <w:r>
+              <w:rPr>
+                <w:sz w:val="17"/>
+              </w:rPr>
+              <w:t>Synthetic battery dataset generator implemented (10 k samples, Gaussian noise, SOH/temp/cycle features)</w:t>
+            </w:r>
+          </w:p>
+        </w:tc>
+        <w:tc>
+          <w:tcPr>
+            <w:tcW w:type="dxa" w:w="2592"/>
+            <w:shd w:val="clear" w:color="auto" w:fill="FFFFFF"/>
+            <w:tcBorders>
+              <w:top w:val="single" w:sz="4" w:space="0" w:color="4472C4"/>
+              <w:left w:val="single" w:sz="4" w:space="0" w:color="4472C4"/>
+              <w:bottom w:val="single" w:sz="4" w:space="0" w:color="4472C4"/>
+              <w:right w:val="single" w:sz="4" w:space="0" w:color="4472C4"/>
+              <w:insideH w:val="single" w:sz="4" w:space="0" w:color="4472C4"/>
+              <w:insideV w:val="single" w:sz="4" w:space="0" w:color="4472C4"/>
+            </w:tcBorders>
+          </w:tcPr>
+          <w:p>
+            <w:pPr>
+              <w:jc w:val="left"/>
+            </w:pPr>
+            <w:r>
+              <w:rPr>
+                <w:sz w:val="17"/>
+              </w:rPr>
+              <w:t>WP-2 — data/mock_data_generator.py</w:t>
+            </w:r>
+          </w:p>
+        </w:tc>
+        <w:tc>
+          <w:tcPr>
+            <w:tcW w:type="dxa" w:w="1872"/>
+            <w:shd w:val="clear" w:color="auto" w:fill="FFFFFF"/>
+            <w:tcBorders>
+              <w:top w:val="single" w:sz="4" w:space="0" w:color="4472C4"/>
+              <w:left w:val="single" w:sz="4" w:space="0" w:color="4472C4"/>
+              <w:bottom w:val="single" w:sz="4" w:space="0" w:color="4472C4"/>
+              <w:right w:val="single" w:sz="4" w:space="0" w:color="4472C4"/>
+              <w:insideH w:val="single" w:sz="4" w:space="0" w:color="4472C4"/>
+              <w:insideV w:val="single" w:sz="4" w:space="0" w:color="4472C4"/>
+            </w:tcBorders>
+          </w:tcPr>
+          <w:p>
+            <w:pPr>
+              <w:jc w:val="left"/>
+            </w:pPr>
+            <w:r>
+              <w:rPr>
+                <w:sz w:val="17"/>
+              </w:rPr>
+              <w:t>Erdem K.</w:t>
+            </w:r>
+          </w:p>
+        </w:tc>
+      </w:tr>
+      <w:tr>
+        <w:tc>
+          <w:tcPr>
+            <w:tcW w:type="dxa" w:w="1872"/>
+            <w:shd w:val="clear" w:color="auto" w:fill="EAF2FB"/>
+            <w:tcBorders>
+              <w:top w:val="single" w:sz="4" w:space="0" w:color="4472C4"/>
+              <w:left w:val="single" w:sz="4" w:space="0" w:color="4472C4"/>
+              <w:bottom w:val="single" w:sz="4" w:space="0" w:color="4472C4"/>
+              <w:right w:val="single" w:sz="4" w:space="0" w:color="4472C4"/>
+              <w:insideH w:val="single" w:sz="4" w:space="0" w:color="4472C4"/>
+              <w:insideV w:val="single" w:sz="4" w:space="0" w:color="4472C4"/>
+            </w:tcBorders>
+          </w:tcPr>
+          <w:p>
+            <w:pPr>
+              <w:jc w:val="left"/>
+            </w:pPr>
+            <w:r>
+              <w:rPr>
+                <w:sz w:val="17"/>
+              </w:rPr>
+              <w:t>May 3–6, 2026</w:t>
+            </w:r>
+          </w:p>
+        </w:tc>
+        <w:tc>
+          <w:tcPr>
+            <w:tcW w:type="dxa" w:w="4176"/>
+            <w:shd w:val="clear" w:color="auto" w:fill="EAF2FB"/>
+            <w:tcBorders>
+              <w:top w:val="single" w:sz="4" w:space="0" w:color="4472C4"/>
+              <w:left w:val="single" w:sz="4" w:space="0" w:color="4472C4"/>
+              <w:bottom w:val="single" w:sz="4" w:space="0" w:color="4472C4"/>
+              <w:right w:val="single" w:sz="4" w:space="0" w:color="4472C4"/>
+              <w:insideH w:val="single" w:sz="4" w:space="0" w:color="4472C4"/>
+              <w:insideV w:val="single" w:sz="4" w:space="0" w:color="4472C4"/>
+            </w:tcBorders>
+          </w:tcPr>
+          <w:p>
+            <w:pPr>
+              <w:jc w:val="left"/>
+            </w:pPr>
+            <w:r>
+              <w:rPr>
+                <w:sz w:val="17"/>
+              </w:rPr>
+              <w:t>Hybrid 1D-CNN + GRU + Attention model coded from scratch in PyTorch; sigmoid output layer added</w:t>
+            </w:r>
+          </w:p>
+        </w:tc>
+        <w:tc>
+          <w:tcPr>
+            <w:tcW w:type="dxa" w:w="2592"/>
+            <w:shd w:val="clear" w:color="auto" w:fill="EAF2FB"/>
+            <w:tcBorders>
+              <w:top w:val="single" w:sz="4" w:space="0" w:color="4472C4"/>
+              <w:left w:val="single" w:sz="4" w:space="0" w:color="4472C4"/>
+              <w:bottom w:val="single" w:sz="4" w:space="0" w:color="4472C4"/>
+              <w:right w:val="single" w:sz="4" w:space="0" w:color="4472C4"/>
+              <w:insideH w:val="single" w:sz="4" w:space="0" w:color="4472C4"/>
+              <w:insideV w:val="single" w:sz="4" w:space="0" w:color="4472C4"/>
+            </w:tcBorders>
+          </w:tcPr>
+          <w:p>
+            <w:pPr>
+              <w:jc w:val="left"/>
+            </w:pPr>
+            <w:r>
+              <w:rPr>
+                <w:sz w:val="17"/>
+              </w:rPr>
+              <w:t>WP-3 — models/cnn_gru_model.py</w:t>
+            </w:r>
+          </w:p>
+        </w:tc>
+        <w:tc>
+          <w:tcPr>
+            <w:tcW w:type="dxa" w:w="1872"/>
+            <w:shd w:val="clear" w:color="auto" w:fill="EAF2FB"/>
+            <w:tcBorders>
+              <w:top w:val="single" w:sz="4" w:space="0" w:color="4472C4"/>
+              <w:left w:val="single" w:sz="4" w:space="0" w:color="4472C4"/>
+              <w:bottom w:val="single" w:sz="4" w:space="0" w:color="4472C4"/>
+              <w:right w:val="single" w:sz="4" w:space="0" w:color="4472C4"/>
+              <w:insideH w:val="single" w:sz="4" w:space="0" w:color="4472C4"/>
+              <w:insideV w:val="single" w:sz="4" w:space="0" w:color="4472C4"/>
+            </w:tcBorders>
+          </w:tcPr>
+          <w:p>
+            <w:pPr>
+              <w:jc w:val="left"/>
+            </w:pPr>
+            <w:r>
+              <w:rPr>
+                <w:sz w:val="17"/>
+              </w:rPr>
+              <w:t>Ömer F. Ş.</w:t>
+            </w:r>
+          </w:p>
+        </w:tc>
+      </w:tr>
+      <w:tr>
+        <w:tc>
+          <w:tcPr>
+            <w:tcW w:type="dxa" w:w="1872"/>
+            <w:shd w:val="clear" w:color="auto" w:fill="FFFFFF"/>
+            <w:tcBorders>
+              <w:top w:val="single" w:sz="4" w:space="0" w:color="4472C4"/>
+              <w:left w:val="single" w:sz="4" w:space="0" w:color="4472C4"/>
+              <w:bottom w:val="single" w:sz="4" w:space="0" w:color="4472C4"/>
+              <w:right w:val="single" w:sz="4" w:space="0" w:color="4472C4"/>
+              <w:insideH w:val="single" w:sz="4" w:space="0" w:color="4472C4"/>
+              <w:insideV w:val="single" w:sz="4" w:space="0" w:color="4472C4"/>
+            </w:tcBorders>
+          </w:tcPr>
+          <w:p>
+            <w:pPr>
+              <w:jc w:val="left"/>
+            </w:pPr>
+            <w:r>
+              <w:rPr>
+                <w:sz w:val="17"/>
+              </w:rPr>
+              <w:t>May 7–10, 2026</w:t>
+            </w:r>
+          </w:p>
+        </w:tc>
+        <w:tc>
+          <w:tcPr>
+            <w:tcW w:type="dxa" w:w="4176"/>
+            <w:shd w:val="clear" w:color="auto" w:fill="FFFFFF"/>
+            <w:tcBorders>
+              <w:top w:val="single" w:sz="4" w:space="0" w:color="4472C4"/>
+              <w:left w:val="single" w:sz="4" w:space="0" w:color="4472C4"/>
+              <w:bottom w:val="single" w:sz="4" w:space="0" w:color="4472C4"/>
+              <w:right w:val="single" w:sz="4" w:space="0" w:color="4472C4"/>
+              <w:insideH w:val="single" w:sz="4" w:space="0" w:color="4472C4"/>
+              <w:insideV w:val="single" w:sz="4" w:space="0" w:color="4472C4"/>
+            </w:tcBorders>
+          </w:tcPr>
+          <w:p>
+            <w:pPr>
+              <w:jc w:val="left"/>
+            </w:pPr>
+            <w:r>
+              <w:rPr>
+                <w:sz w:val="17"/>
+              </w:rPr>
+              <w:t>Training pipeline built: StepLR scheduler, gradient clipping, early stopping; first training run completed</w:t>
+            </w:r>
+          </w:p>
+        </w:tc>
+        <w:tc>
+          <w:tcPr>
+            <w:tcW w:type="dxa" w:w="2592"/>
+            <w:shd w:val="clear" w:color="auto" w:fill="FFFFFF"/>
+            <w:tcBorders>
+              <w:top w:val="single" w:sz="4" w:space="0" w:color="4472C4"/>
+              <w:left w:val="single" w:sz="4" w:space="0" w:color="4472C4"/>
+              <w:bottom w:val="single" w:sz="4" w:space="0" w:color="4472C4"/>
+              <w:right w:val="single" w:sz="4" w:space="0" w:color="4472C4"/>
+              <w:insideH w:val="single" w:sz="4" w:space="0" w:color="4472C4"/>
+              <w:insideV w:val="single" w:sz="4" w:space="0" w:color="4472C4"/>
+            </w:tcBorders>
+          </w:tcPr>
+          <w:p>
+            <w:pPr>
+              <w:jc w:val="left"/>
+            </w:pPr>
+            <w:r>
+              <w:rPr>
+                <w:sz w:val="17"/>
+              </w:rPr>
+              <w:t>WP-4 — models/trainer.py</w:t>
+            </w:r>
+          </w:p>
+        </w:tc>
+        <w:tc>
+          <w:tcPr>
+            <w:tcW w:type="dxa" w:w="1872"/>
+            <w:shd w:val="clear" w:color="auto" w:fill="FFFFFF"/>
+            <w:tcBorders>
+              <w:top w:val="single" w:sz="4" w:space="0" w:color="4472C4"/>
+              <w:left w:val="single" w:sz="4" w:space="0" w:color="4472C4"/>
+              <w:bottom w:val="single" w:sz="4" w:space="0" w:color="4472C4"/>
+              <w:right w:val="single" w:sz="4" w:space="0" w:color="4472C4"/>
+              <w:insideH w:val="single" w:sz="4" w:space="0" w:color="4472C4"/>
+              <w:insideV w:val="single" w:sz="4" w:space="0" w:color="4472C4"/>
+            </w:tcBorders>
+          </w:tcPr>
+          <w:p>
+            <w:pPr>
+              <w:jc w:val="left"/>
+            </w:pPr>
+            <w:r>
+              <w:rPr>
+                <w:sz w:val="17"/>
+              </w:rPr>
+              <w:t>Ömer F. Ş.</w:t>
+            </w:r>
+          </w:p>
+        </w:tc>
+      </w:tr>
+      <w:tr>
+        <w:tc>
+          <w:tcPr>
+            <w:tcW w:type="dxa" w:w="1872"/>
+            <w:shd w:val="clear" w:color="auto" w:fill="EAF2FB"/>
+            <w:tcBorders>
+              <w:top w:val="single" w:sz="4" w:space="0" w:color="4472C4"/>
+              <w:left w:val="single" w:sz="4" w:space="0" w:color="4472C4"/>
+              <w:bottom w:val="single" w:sz="4" w:space="0" w:color="4472C4"/>
+              <w:right w:val="single" w:sz="4" w:space="0" w:color="4472C4"/>
+              <w:insideH w:val="single" w:sz="4" w:space="0" w:color="4472C4"/>
+              <w:insideV w:val="single" w:sz="4" w:space="0" w:color="4472C4"/>
+            </w:tcBorders>
+          </w:tcPr>
+          <w:p>
+            <w:pPr>
+              <w:jc w:val="left"/>
+            </w:pPr>
+            <w:r>
+              <w:rPr>
+                <w:sz w:val="17"/>
+              </w:rPr>
+              <w:t>May 11–13, 2026</w:t>
+            </w:r>
+          </w:p>
+        </w:tc>
+        <w:tc>
+          <w:tcPr>
+            <w:tcW w:type="dxa" w:w="4176"/>
+            <w:shd w:val="clear" w:color="auto" w:fill="EAF2FB"/>
+            <w:tcBorders>
+              <w:top w:val="single" w:sz="4" w:space="0" w:color="4472C4"/>
+              <w:left w:val="single" w:sz="4" w:space="0" w:color="4472C4"/>
+              <w:bottom w:val="single" w:sz="4" w:space="0" w:color="4472C4"/>
+              <w:right w:val="single" w:sz="4" w:space="0" w:color="4472C4"/>
+              <w:insideH w:val="single" w:sz="4" w:space="0" w:color="4472C4"/>
+              <w:insideV w:val="single" w:sz="4" w:space="0" w:color="4472C4"/>
+            </w:tcBorders>
+          </w:tcPr>
+          <w:p>
+            <w:pPr>
+              <w:jc w:val="left"/>
+            </w:pPr>
+            <w:r>
+              <w:rPr>
+                <w:sz w:val="17"/>
+              </w:rPr>
+              <w:t>Hyperparameter sweep (5 configs × 3 metrics); result tables and training-curve plots generated</w:t>
+            </w:r>
+          </w:p>
+        </w:tc>
+        <w:tc>
+          <w:tcPr>
+            <w:tcW w:type="dxa" w:w="2592"/>
+            <w:shd w:val="clear" w:color="auto" w:fill="EAF2FB"/>
+            <w:tcBorders>
+              <w:top w:val="single" w:sz="4" w:space="0" w:color="4472C4"/>
+              <w:left w:val="single" w:sz="4" w:space="0" w:color="4472C4"/>
+              <w:bottom w:val="single" w:sz="4" w:space="0" w:color="4472C4"/>
+              <w:right w:val="single" w:sz="4" w:space="0" w:color="4472C4"/>
+              <w:insideH w:val="single" w:sz="4" w:space="0" w:color="4472C4"/>
+              <w:insideV w:val="single" w:sz="4" w:space="0" w:color="4472C4"/>
+            </w:tcBorders>
+          </w:tcPr>
+          <w:p>
+            <w:pPr>
+              <w:jc w:val="left"/>
+            </w:pPr>
+            <w:r>
+              <w:rPr>
+                <w:sz w:val="17"/>
+              </w:rPr>
+              <w:t>WP-4 — outputs/plots/, experiment_report.txt</w:t>
+            </w:r>
+          </w:p>
+        </w:tc>
+        <w:tc>
+          <w:tcPr>
+            <w:tcW w:type="dxa" w:w="1872"/>
+            <w:shd w:val="clear" w:color="auto" w:fill="EAF2FB"/>
+            <w:tcBorders>
+              <w:top w:val="single" w:sz="4" w:space="0" w:color="4472C4"/>
+              <w:left w:val="single" w:sz="4" w:space="0" w:color="4472C4"/>
+              <w:bottom w:val="single" w:sz="4" w:space="0" w:color="4472C4"/>
+              <w:right w:val="single" w:sz="4" w:space="0" w:color="4472C4"/>
+              <w:insideH w:val="single" w:sz="4" w:space="0" w:color="4472C4"/>
+              <w:insideV w:val="single" w:sz="4" w:space="0" w:color="4472C4"/>
+            </w:tcBorders>
+          </w:tcPr>
+          <w:p>
+            <w:pPr>
+              <w:jc w:val="left"/>
+            </w:pPr>
+            <w:r>
+              <w:rPr>
+                <w:sz w:val="17"/>
+              </w:rPr>
+              <w:t>Ömer F. Ş.</w:t>
+            </w:r>
+          </w:p>
+        </w:tc>
+      </w:tr>
+      <w:tr>
+        <w:tc>
+          <w:tcPr>
+            <w:tcW w:type="dxa" w:w="1872"/>
+            <w:shd w:val="clear" w:color="auto" w:fill="FFFFFF"/>
+            <w:tcBorders>
+              <w:top w:val="single" w:sz="4" w:space="0" w:color="4472C4"/>
+              <w:left w:val="single" w:sz="4" w:space="0" w:color="4472C4"/>
+              <w:bottom w:val="single" w:sz="4" w:space="0" w:color="4472C4"/>
+              <w:right w:val="single" w:sz="4" w:space="0" w:color="4472C4"/>
+              <w:insideH w:val="single" w:sz="4" w:space="0" w:color="4472C4"/>
+              <w:insideV w:val="single" w:sz="4" w:space="0" w:color="4472C4"/>
+            </w:tcBorders>
+          </w:tcPr>
+          <w:p>
+            <w:pPr>
+              <w:jc w:val="left"/>
+            </w:pPr>
+            <w:r>
+              <w:rPr>
+                <w:sz w:val="17"/>
+              </w:rPr>
+              <w:t>May 14–15, 2026</w:t>
+            </w:r>
+          </w:p>
+        </w:tc>
+        <w:tc>
+          <w:tcPr>
+            <w:tcW w:type="dxa" w:w="4176"/>
+            <w:shd w:val="clear" w:color="auto" w:fill="FFFFFF"/>
+            <w:tcBorders>
+              <w:top w:val="single" w:sz="4" w:space="0" w:color="4472C4"/>
+              <w:left w:val="single" w:sz="4" w:space="0" w:color="4472C4"/>
+              <w:bottom w:val="single" w:sz="4" w:space="0" w:color="4472C4"/>
+              <w:right w:val="single" w:sz="4" w:space="0" w:color="4472C4"/>
+              <w:insideH w:val="single" w:sz="4" w:space="0" w:color="4472C4"/>
+              <w:insideV w:val="single" w:sz="4" w:space="0" w:color="4472C4"/>
+            </w:tcBorders>
+          </w:tcPr>
+          <w:p>
+            <w:pPr>
+              <w:jc w:val="left"/>
+            </w:pPr>
+            <w:r>
+              <w:rPr>
+                <w:sz w:val="17"/>
+              </w:rPr>
+              <w:t>Three tool classes implemented: BatteryRULTool, GridTariffAPITool, RoutePlannerTool</w:t>
+            </w:r>
+          </w:p>
+        </w:tc>
+        <w:tc>
+          <w:tcPr>
+            <w:tcW w:type="dxa" w:w="2592"/>
+            <w:shd w:val="clear" w:color="auto" w:fill="FFFFFF"/>
+            <w:tcBorders>
+              <w:top w:val="single" w:sz="4" w:space="0" w:color="4472C4"/>
+              <w:left w:val="single" w:sz="4" w:space="0" w:color="4472C4"/>
+              <w:bottom w:val="single" w:sz="4" w:space="0" w:color="4472C4"/>
+              <w:right w:val="single" w:sz="4" w:space="0" w:color="4472C4"/>
+              <w:insideH w:val="single" w:sz="4" w:space="0" w:color="4472C4"/>
+              <w:insideV w:val="single" w:sz="4" w:space="0" w:color="4472C4"/>
+            </w:tcBorders>
+          </w:tcPr>
+          <w:p>
+            <w:pPr>
+              <w:jc w:val="left"/>
+            </w:pPr>
+            <w:r>
+              <w:rPr>
+                <w:sz w:val="17"/>
+              </w:rPr>
+              <w:t>WP-5 — tools/*.py</w:t>
+            </w:r>
+          </w:p>
+        </w:tc>
+        <w:tc>
+          <w:tcPr>
+            <w:tcW w:type="dxa" w:w="1872"/>
+            <w:shd w:val="clear" w:color="auto" w:fill="FFFFFF"/>
+            <w:tcBorders>
+              <w:top w:val="single" w:sz="4" w:space="0" w:color="4472C4"/>
+              <w:left w:val="single" w:sz="4" w:space="0" w:color="4472C4"/>
+              <w:bottom w:val="single" w:sz="4" w:space="0" w:color="4472C4"/>
+              <w:right w:val="single" w:sz="4" w:space="0" w:color="4472C4"/>
+              <w:insideH w:val="single" w:sz="4" w:space="0" w:color="4472C4"/>
+              <w:insideV w:val="single" w:sz="4" w:space="0" w:color="4472C4"/>
+            </w:tcBorders>
+          </w:tcPr>
+          <w:p>
+            <w:pPr>
+              <w:jc w:val="left"/>
+            </w:pPr>
+            <w:r>
+              <w:rPr>
+                <w:sz w:val="17"/>
+              </w:rPr>
+              <w:t>Erdem K.</w:t>
+            </w:r>
+          </w:p>
+        </w:tc>
+      </w:tr>
+      <w:tr>
+        <w:tc>
+          <w:tcPr>
+            <w:tcW w:type="dxa" w:w="1872"/>
+            <w:shd w:val="clear" w:color="auto" w:fill="EAF2FB"/>
+            <w:tcBorders>
+              <w:top w:val="single" w:sz="4" w:space="0" w:color="4472C4"/>
+              <w:left w:val="single" w:sz="4" w:space="0" w:color="4472C4"/>
+              <w:bottom w:val="single" w:sz="4" w:space="0" w:color="4472C4"/>
+              <w:right w:val="single" w:sz="4" w:space="0" w:color="4472C4"/>
+              <w:insideH w:val="single" w:sz="4" w:space="0" w:color="4472C4"/>
+              <w:insideV w:val="single" w:sz="4" w:space="0" w:color="4472C4"/>
+            </w:tcBorders>
+          </w:tcPr>
+          <w:p>
+            <w:pPr>
+              <w:jc w:val="left"/>
+            </w:pPr>
+            <w:r>
+              <w:rPr>
+                <w:sz w:val="17"/>
+              </w:rPr>
+              <w:t>May 15–17, 2026</w:t>
+            </w:r>
+          </w:p>
+        </w:tc>
+        <w:tc>
+          <w:tcPr>
+            <w:tcW w:type="dxa" w:w="4176"/>
+            <w:shd w:val="clear" w:color="auto" w:fill="EAF2FB"/>
+            <w:tcBorders>
+              <w:top w:val="single" w:sz="4" w:space="0" w:color="4472C4"/>
+              <w:left w:val="single" w:sz="4" w:space="0" w:color="4472C4"/>
+              <w:bottom w:val="single" w:sz="4" w:space="0" w:color="4472C4"/>
+              <w:right w:val="single" w:sz="4" w:space="0" w:color="4472C4"/>
+              <w:insideH w:val="single" w:sz="4" w:space="0" w:color="4472C4"/>
+              <w:insideV w:val="single" w:sz="4" w:space="0" w:color="4472C4"/>
+            </w:tcBorders>
+          </w:tcPr>
+          <w:p>
+            <w:pPr>
+              <w:jc w:val="left"/>
+            </w:pPr>
+            <w:r>
+              <w:rPr>
+                <w:sz w:val="17"/>
+              </w:rPr>
+              <w:t>BaseAgent (ReAct loop) coded; BatteryGuardian, GridTariff, SmartTrip agents implemented</w:t>
+            </w:r>
+          </w:p>
+        </w:tc>
+        <w:tc>
+          <w:tcPr>
+            <w:tcW w:type="dxa" w:w="2592"/>
+            <w:shd w:val="clear" w:color="auto" w:fill="EAF2FB"/>
+            <w:tcBorders>
+              <w:top w:val="single" w:sz="4" w:space="0" w:color="4472C4"/>
+              <w:left w:val="single" w:sz="4" w:space="0" w:color="4472C4"/>
+              <w:bottom w:val="single" w:sz="4" w:space="0" w:color="4472C4"/>
+              <w:right w:val="single" w:sz="4" w:space="0" w:color="4472C4"/>
+              <w:insideH w:val="single" w:sz="4" w:space="0" w:color="4472C4"/>
+              <w:insideV w:val="single" w:sz="4" w:space="0" w:color="4472C4"/>
+            </w:tcBorders>
+          </w:tcPr>
+          <w:p>
+            <w:pPr>
+              <w:jc w:val="left"/>
+            </w:pPr>
+            <w:r>
+              <w:rPr>
+                <w:sz w:val="17"/>
+              </w:rPr>
+              <w:t>WP-6 — agents/*.py</w:t>
+            </w:r>
+          </w:p>
+        </w:tc>
+        <w:tc>
+          <w:tcPr>
+            <w:tcW w:type="dxa" w:w="1872"/>
+            <w:shd w:val="clear" w:color="auto" w:fill="EAF2FB"/>
+            <w:tcBorders>
+              <w:top w:val="single" w:sz="4" w:space="0" w:color="4472C4"/>
+              <w:left w:val="single" w:sz="4" w:space="0" w:color="4472C4"/>
+              <w:bottom w:val="single" w:sz="4" w:space="0" w:color="4472C4"/>
+              <w:right w:val="single" w:sz="4" w:space="0" w:color="4472C4"/>
+              <w:insideH w:val="single" w:sz="4" w:space="0" w:color="4472C4"/>
+              <w:insideV w:val="single" w:sz="4" w:space="0" w:color="4472C4"/>
+            </w:tcBorders>
+          </w:tcPr>
+          <w:p>
+            <w:pPr>
+              <w:jc w:val="left"/>
+            </w:pPr>
+            <w:r>
+              <w:rPr>
+                <w:sz w:val="17"/>
+              </w:rPr>
+              <w:t>Erdem K. &amp; Ömer F. Ş.</w:t>
+            </w:r>
+          </w:p>
+        </w:tc>
+      </w:tr>
+      <w:tr>
+        <w:tc>
+          <w:tcPr>
+            <w:tcW w:type="dxa" w:w="1872"/>
+            <w:shd w:val="clear" w:color="auto" w:fill="FFFFFF"/>
+            <w:tcBorders>
+              <w:top w:val="single" w:sz="4" w:space="0" w:color="4472C4"/>
+              <w:left w:val="single" w:sz="4" w:space="0" w:color="4472C4"/>
+              <w:bottom w:val="single" w:sz="4" w:space="0" w:color="4472C4"/>
+              <w:right w:val="single" w:sz="4" w:space="0" w:color="4472C4"/>
+              <w:insideH w:val="single" w:sz="4" w:space="0" w:color="4472C4"/>
+              <w:insideV w:val="single" w:sz="4" w:space="0" w:color="4472C4"/>
+            </w:tcBorders>
+          </w:tcPr>
+          <w:p>
+            <w:pPr>
+              <w:jc w:val="left"/>
+            </w:pPr>
+            <w:r>
+              <w:rPr>
+                <w:sz w:val="17"/>
+              </w:rPr>
+              <w:t>May 17–18, 2026</w:t>
+            </w:r>
+          </w:p>
+        </w:tc>
+        <w:tc>
+          <w:tcPr>
+            <w:tcW w:type="dxa" w:w="4176"/>
+            <w:shd w:val="clear" w:color="auto" w:fill="FFFFFF"/>
+            <w:tcBorders>
+              <w:top w:val="single" w:sz="4" w:space="0" w:color="4472C4"/>
+              <w:left w:val="single" w:sz="4" w:space="0" w:color="4472C4"/>
+              <w:bottom w:val="single" w:sz="4" w:space="0" w:color="4472C4"/>
+              <w:right w:val="single" w:sz="4" w:space="0" w:color="4472C4"/>
+              <w:insideH w:val="single" w:sz="4" w:space="0" w:color="4472C4"/>
+              <w:insideV w:val="single" w:sz="4" w:space="0" w:color="4472C4"/>
+            </w:tcBorders>
+          </w:tcPr>
+          <w:p>
+            <w:pPr>
+              <w:jc w:val="left"/>
+            </w:pPr>
+            <w:r>
+              <w:rPr>
+                <w:sz w:val="17"/>
+              </w:rPr>
+              <w:t>CrewOrchestrator built; inter-agent messaging and end-to-end scenario validated; main.py wired up</w:t>
+            </w:r>
+          </w:p>
+        </w:tc>
+        <w:tc>
+          <w:tcPr>
+            <w:tcW w:type="dxa" w:w="2592"/>
+            <w:shd w:val="clear" w:color="auto" w:fill="FFFFFF"/>
+            <w:tcBorders>
+              <w:top w:val="single" w:sz="4" w:space="0" w:color="4472C4"/>
+              <w:left w:val="single" w:sz="4" w:space="0" w:color="4472C4"/>
+              <w:bottom w:val="single" w:sz="4" w:space="0" w:color="4472C4"/>
+              <w:right w:val="single" w:sz="4" w:space="0" w:color="4472C4"/>
+              <w:insideH w:val="single" w:sz="4" w:space="0" w:color="4472C4"/>
+              <w:insideV w:val="single" w:sz="4" w:space="0" w:color="4472C4"/>
+            </w:tcBorders>
+          </w:tcPr>
+          <w:p>
+            <w:pPr>
+              <w:jc w:val="left"/>
+            </w:pPr>
+            <w:r>
+              <w:rPr>
+                <w:sz w:val="17"/>
+              </w:rPr>
+              <w:t>WP-7 — orchestrator/crew_orchestrator.py, main.py</w:t>
+            </w:r>
+          </w:p>
+        </w:tc>
+        <w:tc>
+          <w:tcPr>
+            <w:tcW w:type="dxa" w:w="1872"/>
+            <w:shd w:val="clear" w:color="auto" w:fill="FFFFFF"/>
+            <w:tcBorders>
+              <w:top w:val="single" w:sz="4" w:space="0" w:color="4472C4"/>
+              <w:left w:val="single" w:sz="4" w:space="0" w:color="4472C4"/>
+              <w:bottom w:val="single" w:sz="4" w:space="0" w:color="4472C4"/>
+              <w:right w:val="single" w:sz="4" w:space="0" w:color="4472C4"/>
+              <w:insideH w:val="single" w:sz="4" w:space="0" w:color="4472C4"/>
+              <w:insideV w:val="single" w:sz="4" w:space="0" w:color="4472C4"/>
+            </w:tcBorders>
+          </w:tcPr>
+          <w:p>
+            <w:pPr>
+              <w:jc w:val="left"/>
+            </w:pPr>
+            <w:r>
+              <w:rPr>
+                <w:sz w:val="17"/>
+              </w:rPr>
+              <w:t>Ömer F. Ş.</w:t>
+            </w:r>
+          </w:p>
+        </w:tc>
+      </w:tr>
+      <w:tr>
+        <w:tc>
+          <w:tcPr>
+            <w:tcW w:type="dxa" w:w="1872"/>
+            <w:shd w:val="clear" w:color="auto" w:fill="EAF2FB"/>
+            <w:tcBorders>
+              <w:top w:val="single" w:sz="4" w:space="0" w:color="4472C4"/>
+              <w:left w:val="single" w:sz="4" w:space="0" w:color="4472C4"/>
+              <w:bottom w:val="single" w:sz="4" w:space="0" w:color="4472C4"/>
+              <w:right w:val="single" w:sz="4" w:space="0" w:color="4472C4"/>
+              <w:insideH w:val="single" w:sz="4" w:space="0" w:color="4472C4"/>
+              <w:insideV w:val="single" w:sz="4" w:space="0" w:color="4472C4"/>
+            </w:tcBorders>
+          </w:tcPr>
+          <w:p>
+            <w:pPr>
+              <w:jc w:val="left"/>
+            </w:pPr>
+            <w:r>
+              <w:rPr>
+                <w:sz w:val="17"/>
+              </w:rPr>
+              <w:t>May 18, 2026</w:t>
+            </w:r>
+          </w:p>
+        </w:tc>
+        <w:tc>
+          <w:tcPr>
+            <w:tcW w:type="dxa" w:w="4176"/>
+            <w:shd w:val="clear" w:color="auto" w:fill="EAF2FB"/>
+            <w:tcBorders>
+              <w:top w:val="single" w:sz="4" w:space="0" w:color="4472C4"/>
+              <w:left w:val="single" w:sz="4" w:space="0" w:color="4472C4"/>
+              <w:bottom w:val="single" w:sz="4" w:space="0" w:color="4472C4"/>
+              <w:right w:val="single" w:sz="4" w:space="0" w:color="4472C4"/>
+              <w:insideH w:val="single" w:sz="4" w:space="0" w:color="4472C4"/>
+              <w:insideV w:val="single" w:sz="4" w:space="0" w:color="4472C4"/>
+            </w:tcBorders>
+          </w:tcPr>
+          <w:p>
+            <w:pPr>
+              <w:jc w:val="left"/>
+            </w:pPr>
+            <w:r>
+              <w:rPr>
+                <w:sz w:val="17"/>
+              </w:rPr>
+              <w:t>Initial GitHub commit: all source code, model weights, plots, and first report draft pushed</w:t>
+            </w:r>
+          </w:p>
+        </w:tc>
+        <w:tc>
+          <w:tcPr>
+            <w:tcW w:type="dxa" w:w="2592"/>
+            <w:shd w:val="clear" w:color="auto" w:fill="EAF2FB"/>
+            <w:tcBorders>
+              <w:top w:val="single" w:sz="4" w:space="0" w:color="4472C4"/>
+              <w:left w:val="single" w:sz="4" w:space="0" w:color="4472C4"/>
+              <w:bottom w:val="single" w:sz="4" w:space="0" w:color="4472C4"/>
+              <w:right w:val="single" w:sz="4" w:space="0" w:color="4472C4"/>
+              <w:insideH w:val="single" w:sz="4" w:space="0" w:color="4472C4"/>
+              <w:insideV w:val="single" w:sz="4" w:space="0" w:color="4472C4"/>
+            </w:tcBorders>
+          </w:tcPr>
+          <w:p>
+            <w:pPr>
+              <w:jc w:val="left"/>
+            </w:pPr>
+            <w:r>
+              <w:rPr>
+                <w:sz w:val="17"/>
+              </w:rPr>
+              <w:t>All WPs — git commit d5b0404</w:t>
+            </w:r>
+          </w:p>
+        </w:tc>
+        <w:tc>
+          <w:tcPr>
+            <w:tcW w:type="dxa" w:w="1872"/>
+            <w:shd w:val="clear" w:color="auto" w:fill="EAF2FB"/>
+            <w:tcBorders>
+              <w:top w:val="single" w:sz="4" w:space="0" w:color="4472C4"/>
+              <w:left w:val="single" w:sz="4" w:space="0" w:color="4472C4"/>
+              <w:bottom w:val="single" w:sz="4" w:space="0" w:color="4472C4"/>
+              <w:right w:val="single" w:sz="4" w:space="0" w:color="4472C4"/>
+              <w:insideH w:val="single" w:sz="4" w:space="0" w:color="4472C4"/>
+              <w:insideV w:val="single" w:sz="4" w:space="0" w:color="4472C4"/>
+            </w:tcBorders>
+          </w:tcPr>
+          <w:p>
+            <w:pPr>
+              <w:jc w:val="left"/>
+            </w:pPr>
+            <w:r>
+              <w:rPr>
+                <w:sz w:val="17"/>
+              </w:rPr>
+              <w:t>Erdem K. &amp; Ömer F. Ş.</w:t>
+            </w:r>
+          </w:p>
+        </w:tc>
+      </w:tr>
+      <w:tr>
+        <w:tc>
+          <w:tcPr>
+            <w:tcW w:type="dxa" w:w="1872"/>
+            <w:shd w:val="clear" w:color="auto" w:fill="FFFFFF"/>
+            <w:tcBorders>
+              <w:top w:val="single" w:sz="4" w:space="0" w:color="4472C4"/>
+              <w:left w:val="single" w:sz="4" w:space="0" w:color="4472C4"/>
+              <w:bottom w:val="single" w:sz="4" w:space="0" w:color="4472C4"/>
+              <w:right w:val="single" w:sz="4" w:space="0" w:color="4472C4"/>
+              <w:insideH w:val="single" w:sz="4" w:space="0" w:color="4472C4"/>
+              <w:insideV w:val="single" w:sz="4" w:space="0" w:color="4472C4"/>
+            </w:tcBorders>
+          </w:tcPr>
+          <w:p>
+            <w:pPr>
+              <w:jc w:val="left"/>
+            </w:pPr>
+            <w:r>
+              <w:rPr>
+                <w:sz w:val="17"/>
+              </w:rPr>
+              <w:t>May 18, 2026</w:t>
+            </w:r>
+          </w:p>
+        </w:tc>
+        <w:tc>
+          <w:tcPr>
+            <w:tcW w:type="dxa" w:w="4176"/>
+            <w:shd w:val="clear" w:color="auto" w:fill="FFFFFF"/>
+            <w:tcBorders>
+              <w:top w:val="single" w:sz="4" w:space="0" w:color="4472C4"/>
+              <w:left w:val="single" w:sz="4" w:space="0" w:color="4472C4"/>
+              <w:bottom w:val="single" w:sz="4" w:space="0" w:color="4472C4"/>
+              <w:right w:val="single" w:sz="4" w:space="0" w:color="4472C4"/>
+              <w:insideH w:val="single" w:sz="4" w:space="0" w:color="4472C4"/>
+              <w:insideV w:val="single" w:sz="4" w:space="0" w:color="4472C4"/>
+            </w:tcBorders>
+          </w:tcPr>
+          <w:p>
+            <w:pPr>
+              <w:jc w:val="left"/>
+            </w:pPr>
+            <w:r>
+              <w:rPr>
+                <w:sz w:val="17"/>
+              </w:rPr>
+              <w:t>README updated with GitHub repository link and virtual-environment setup instructions</w:t>
+            </w:r>
+          </w:p>
+        </w:tc>
+        <w:tc>
+          <w:tcPr>
+            <w:tcW w:type="dxa" w:w="2592"/>
+            <w:shd w:val="clear" w:color="auto" w:fill="FFFFFF"/>
+            <w:tcBorders>
+              <w:top w:val="single" w:sz="4" w:space="0" w:color="4472C4"/>
+              <w:left w:val="single" w:sz="4" w:space="0" w:color="4472C4"/>
+              <w:bottom w:val="single" w:sz="4" w:space="0" w:color="4472C4"/>
+              <w:right w:val="single" w:sz="4" w:space="0" w:color="4472C4"/>
+              <w:insideH w:val="single" w:sz="4" w:space="0" w:color="4472C4"/>
+              <w:insideV w:val="single" w:sz="4" w:space="0" w:color="4472C4"/>
+            </w:tcBorders>
+          </w:tcPr>
+          <w:p>
+            <w:pPr>
+              <w:jc w:val="left"/>
+            </w:pPr>
+            <w:r>
+              <w:rPr>
+                <w:sz w:val="17"/>
+              </w:rPr>
+              <w:t>README.md — git commit 6e57612</w:t>
+            </w:r>
+          </w:p>
+        </w:tc>
+        <w:tc>
+          <w:tcPr>
+            <w:tcW w:type="dxa" w:w="1872"/>
+            <w:shd w:val="clear" w:color="auto" w:fill="FFFFFF"/>
+            <w:tcBorders>
+              <w:top w:val="single" w:sz="4" w:space="0" w:color="4472C4"/>
+              <w:left w:val="single" w:sz="4" w:space="0" w:color="4472C4"/>
+              <w:bottom w:val="single" w:sz="4" w:space="0" w:color="4472C4"/>
+              <w:right w:val="single" w:sz="4" w:space="0" w:color="4472C4"/>
+              <w:insideH w:val="single" w:sz="4" w:space="0" w:color="4472C4"/>
+              <w:insideV w:val="single" w:sz="4" w:space="0" w:color="4472C4"/>
+            </w:tcBorders>
+          </w:tcPr>
+          <w:p>
+            <w:pPr>
+              <w:jc w:val="left"/>
+            </w:pPr>
+            <w:r>
+              <w:rPr>
+                <w:sz w:val="17"/>
+              </w:rPr>
+              <w:t>Erdem K.</w:t>
+            </w:r>
+          </w:p>
+        </w:tc>
+      </w:tr>
+      <w:tr>
+        <w:tc>
+          <w:tcPr>
+            <w:tcW w:type="dxa" w:w="1872"/>
+            <w:shd w:val="clear" w:color="auto" w:fill="EAF2FB"/>
+            <w:tcBorders>
+              <w:top w:val="single" w:sz="4" w:space="0" w:color="4472C4"/>
+              <w:left w:val="single" w:sz="4" w:space="0" w:color="4472C4"/>
+              <w:bottom w:val="single" w:sz="4" w:space="0" w:color="4472C4"/>
+              <w:right w:val="single" w:sz="4" w:space="0" w:color="4472C4"/>
+              <w:insideH w:val="single" w:sz="4" w:space="0" w:color="4472C4"/>
+              <w:insideV w:val="single" w:sz="4" w:space="0" w:color="4472C4"/>
+            </w:tcBorders>
+          </w:tcPr>
+          <w:p>
+            <w:pPr>
+              <w:jc w:val="left"/>
+            </w:pPr>
+            <w:r>
+              <w:rPr>
+                <w:sz w:val="17"/>
+              </w:rPr>
+              <w:t>Jun 3, 2026</w:t>
+            </w:r>
+          </w:p>
+        </w:tc>
+        <w:tc>
+          <w:tcPr>
+            <w:tcW w:type="dxa" w:w="4176"/>
+            <w:shd w:val="clear" w:color="auto" w:fill="EAF2FB"/>
+            <w:tcBorders>
+              <w:top w:val="single" w:sz="4" w:space="0" w:color="4472C4"/>
+              <w:left w:val="single" w:sz="4" w:space="0" w:color="4472C4"/>
+              <w:bottom w:val="single" w:sz="4" w:space="0" w:color="4472C4"/>
+              <w:right w:val="single" w:sz="4" w:space="0" w:color="4472C4"/>
+              <w:insideH w:val="single" w:sz="4" w:space="0" w:color="4472C4"/>
+              <w:insideV w:val="single" w:sz="4" w:space="0" w:color="4472C4"/>
+            </w:tcBorders>
+          </w:tcPr>
+          <w:p>
+            <w:pPr>
+              <w:jc w:val="left"/>
+            </w:pPr>
+            <w:r>
+              <w:rPr>
+                <w:sz w:val="17"/>
+              </w:rPr>
+              <w:t>All inline code comments translated to English across every module for clarity</w:t>
+            </w:r>
+          </w:p>
+        </w:tc>
+        <w:tc>
+          <w:tcPr>
+            <w:tcW w:type="dxa" w:w="2592"/>
+            <w:shd w:val="clear" w:color="auto" w:fill="EAF2FB"/>
+            <w:tcBorders>
+              <w:top w:val="single" w:sz="4" w:space="0" w:color="4472C4"/>
+              <w:left w:val="single" w:sz="4" w:space="0" w:color="4472C4"/>
+              <w:bottom w:val="single" w:sz="4" w:space="0" w:color="4472C4"/>
+              <w:right w:val="single" w:sz="4" w:space="0" w:color="4472C4"/>
+              <w:insideH w:val="single" w:sz="4" w:space="0" w:color="4472C4"/>
+              <w:insideV w:val="single" w:sz="4" w:space="0" w:color="4472C4"/>
+            </w:tcBorders>
+          </w:tcPr>
+          <w:p>
+            <w:pPr>
+              <w:jc w:val="left"/>
+            </w:pPr>
+            <w:r>
+              <w:rPr>
+                <w:sz w:val="17"/>
+              </w:rPr>
+              <w:t>All source files — git commit 9dd5183</w:t>
+            </w:r>
+          </w:p>
+        </w:tc>
+        <w:tc>
+          <w:tcPr>
+            <w:tcW w:type="dxa" w:w="1872"/>
+            <w:shd w:val="clear" w:color="auto" w:fill="EAF2FB"/>
+            <w:tcBorders>
+              <w:top w:val="single" w:sz="4" w:space="0" w:color="4472C4"/>
+              <w:left w:val="single" w:sz="4" w:space="0" w:color="4472C4"/>
+              <w:bottom w:val="single" w:sz="4" w:space="0" w:color="4472C4"/>
+              <w:right w:val="single" w:sz="4" w:space="0" w:color="4472C4"/>
+              <w:insideH w:val="single" w:sz="4" w:space="0" w:color="4472C4"/>
+              <w:insideV w:val="single" w:sz="4" w:space="0" w:color="4472C4"/>
+            </w:tcBorders>
+          </w:tcPr>
+          <w:p>
+            <w:pPr>
+              <w:jc w:val="left"/>
+            </w:pPr>
+            <w:r>
+              <w:rPr>
+                <w:sz w:val="17"/>
+              </w:rPr>
+              <w:t>Erdem K.</w:t>
+            </w:r>
+          </w:p>
+        </w:tc>
+      </w:tr>
+      <w:tr>
+        <w:tc>
+          <w:tcPr>
+            <w:tcW w:type="dxa" w:w="1872"/>
+            <w:shd w:val="clear" w:color="auto" w:fill="FFFFFF"/>
+            <w:tcBorders>
+              <w:top w:val="single" w:sz="4" w:space="0" w:color="4472C4"/>
+              <w:left w:val="single" w:sz="4" w:space="0" w:color="4472C4"/>
+              <w:bottom w:val="single" w:sz="4" w:space="0" w:color="4472C4"/>
+              <w:right w:val="single" w:sz="4" w:space="0" w:color="4472C4"/>
+              <w:insideH w:val="single" w:sz="4" w:space="0" w:color="4472C4"/>
+              <w:insideV w:val="single" w:sz="4" w:space="0" w:color="4472C4"/>
+            </w:tcBorders>
+          </w:tcPr>
+          <w:p>
+            <w:pPr>
+              <w:jc w:val="left"/>
+            </w:pPr>
+            <w:r>
+              <w:rPr>
+                <w:sz w:val="17"/>
+              </w:rPr>
+              <w:t>Jun 5, 2026</w:t>
+            </w:r>
+          </w:p>
+        </w:tc>
+        <w:tc>
+          <w:tcPr>
+            <w:tcW w:type="dxa" w:w="4176"/>
+            <w:shd w:val="clear" w:color="auto" w:fill="FFFFFF"/>
+            <w:tcBorders>
+              <w:top w:val="single" w:sz="4" w:space="0" w:color="4472C4"/>
+              <w:left w:val="single" w:sz="4" w:space="0" w:color="4472C4"/>
+              <w:bottom w:val="single" w:sz="4" w:space="0" w:color="4472C4"/>
+              <w:right w:val="single" w:sz="4" w:space="0" w:color="4472C4"/>
+              <w:insideH w:val="single" w:sz="4" w:space="0" w:color="4472C4"/>
+              <w:insideV w:val="single" w:sz="4" w:space="0" w:color="4472C4"/>
+            </w:tcBorders>
+          </w:tcPr>
+          <w:p>
+            <w:pPr>
+              <w:jc w:val="left"/>
+            </w:pPr>
+            <w:r>
+              <w:rPr>
+                <w:sz w:val="17"/>
+              </w:rPr>
+              <w:t>Output plots renamed to English; Report_EN.docx prepared; architecture diagram and terminal screenshot added</w:t>
+            </w:r>
+          </w:p>
+        </w:tc>
+        <w:tc>
+          <w:tcPr>
+            <w:tcW w:type="dxa" w:w="2592"/>
+            <w:shd w:val="clear" w:color="auto" w:fill="FFFFFF"/>
+            <w:tcBorders>
+              <w:top w:val="single" w:sz="4" w:space="0" w:color="4472C4"/>
+              <w:left w:val="single" w:sz="4" w:space="0" w:color="4472C4"/>
+              <w:bottom w:val="single" w:sz="4" w:space="0" w:color="4472C4"/>
+              <w:right w:val="single" w:sz="4" w:space="0" w:color="4472C4"/>
+              <w:insideH w:val="single" w:sz="4" w:space="0" w:color="4472C4"/>
+              <w:insideV w:val="single" w:sz="4" w:space="0" w:color="4472C4"/>
+            </w:tcBorders>
+          </w:tcPr>
+          <w:p>
+            <w:pPr>
+              <w:jc w:val="left"/>
+            </w:pPr>
+            <w:r>
+              <w:rPr>
+                <w:sz w:val="17"/>
+              </w:rPr>
+              <w:t>Report_EN.docx, outputs/plots/ — git commit 00a438b</w:t>
+            </w:r>
+          </w:p>
+        </w:tc>
+        <w:tc>
+          <w:tcPr>
+            <w:tcW w:type="dxa" w:w="1872"/>
+            <w:shd w:val="clear" w:color="auto" w:fill="FFFFFF"/>
+            <w:tcBorders>
+              <w:top w:val="single" w:sz="4" w:space="0" w:color="4472C4"/>
+              <w:left w:val="single" w:sz="4" w:space="0" w:color="4472C4"/>
+              <w:bottom w:val="single" w:sz="4" w:space="0" w:color="4472C4"/>
+              <w:right w:val="single" w:sz="4" w:space="0" w:color="4472C4"/>
+              <w:insideH w:val="single" w:sz="4" w:space="0" w:color="4472C4"/>
+              <w:insideV w:val="single" w:sz="4" w:space="0" w:color="4472C4"/>
+            </w:tcBorders>
+          </w:tcPr>
+          <w:p>
+            <w:pPr>
+              <w:jc w:val="left"/>
+            </w:pPr>
+            <w:r>
+              <w:rPr>
+                <w:sz w:val="17"/>
+              </w:rPr>
+              <w:t>Erdem K. &amp; Ömer F. Ş.</w:t>
+            </w:r>
+          </w:p>
+        </w:tc>
+      </w:tr>
+      <w:tr>
+        <w:tc>
+          <w:tcPr>
+            <w:tcW w:type="dxa" w:w="1872"/>
+            <w:shd w:val="clear" w:color="auto" w:fill="EAF2FB"/>
+            <w:tcBorders>
+              <w:top w:val="single" w:sz="4" w:space="0" w:color="4472C4"/>
+              <w:left w:val="single" w:sz="4" w:space="0" w:color="4472C4"/>
+              <w:bottom w:val="single" w:sz="4" w:space="0" w:color="4472C4"/>
+              <w:right w:val="single" w:sz="4" w:space="0" w:color="4472C4"/>
+              <w:insideH w:val="single" w:sz="4" w:space="0" w:color="4472C4"/>
+              <w:insideV w:val="single" w:sz="4" w:space="0" w:color="4472C4"/>
+            </w:tcBorders>
+          </w:tcPr>
+          <w:p>
+            <w:pPr>
+              <w:jc w:val="left"/>
+            </w:pPr>
+            <w:r>
+              <w:rPr>
+                <w:sz w:val="17"/>
+              </w:rPr>
+              <w:t>Jun 5, 2026</w:t>
+            </w:r>
+          </w:p>
+        </w:tc>
+        <w:tc>
+          <w:tcPr>
+            <w:tcW w:type="dxa" w:w="4176"/>
+            <w:shd w:val="clear" w:color="auto" w:fill="EAF2FB"/>
+            <w:tcBorders>
+              <w:top w:val="single" w:sz="4" w:space="0" w:color="4472C4"/>
+              <w:left w:val="single" w:sz="4" w:space="0" w:color="4472C4"/>
+              <w:bottom w:val="single" w:sz="4" w:space="0" w:color="4472C4"/>
+              <w:right w:val="single" w:sz="4" w:space="0" w:color="4472C4"/>
+              <w:insideH w:val="single" w:sz="4" w:space="0" w:color="4472C4"/>
+              <w:insideV w:val="single" w:sz="4" w:space="0" w:color="4472C4"/>
+            </w:tcBorders>
+          </w:tcPr>
+          <w:p>
+            <w:pPr>
+              <w:jc w:val="left"/>
+            </w:pPr>
+            <w:r>
+              <w:rPr>
+                <w:sz w:val="17"/>
+              </w:rPr>
+              <w:t>Work Continuity section (this table) added to the report; final repository push</w:t>
+            </w:r>
+          </w:p>
+        </w:tc>
+        <w:tc>
+          <w:tcPr>
+            <w:tcW w:type="dxa" w:w="2592"/>
+            <w:shd w:val="clear" w:color="auto" w:fill="EAF2FB"/>
+            <w:tcBorders>
+              <w:top w:val="single" w:sz="4" w:space="0" w:color="4472C4"/>
+              <w:left w:val="single" w:sz="4" w:space="0" w:color="4472C4"/>
+              <w:bottom w:val="single" w:sz="4" w:space="0" w:color="4472C4"/>
+              <w:right w:val="single" w:sz="4" w:space="0" w:color="4472C4"/>
+              <w:insideH w:val="single" w:sz="4" w:space="0" w:color="4472C4"/>
+              <w:insideV w:val="single" w:sz="4" w:space="0" w:color="4472C4"/>
+            </w:tcBorders>
+          </w:tcPr>
+          <w:p>
+            <w:pPr>
+              <w:jc w:val="left"/>
+            </w:pPr>
+            <w:r>
+              <w:rPr>
+                <w:sz w:val="17"/>
+              </w:rPr>
+              <w:t>Report_EN.docx (Appendix 7)</w:t>
+            </w:r>
+          </w:p>
+        </w:tc>
+        <w:tc>
+          <w:tcPr>
+            <w:tcW w:type="dxa" w:w="1872"/>
+            <w:shd w:val="clear" w:color="auto" w:fill="EAF2FB"/>
+            <w:tcBorders>
+              <w:top w:val="single" w:sz="4" w:space="0" w:color="4472C4"/>
+              <w:left w:val="single" w:sz="4" w:space="0" w:color="4472C4"/>
+              <w:bottom w:val="single" w:sz="4" w:space="0" w:color="4472C4"/>
+              <w:right w:val="single" w:sz="4" w:space="0" w:color="4472C4"/>
+              <w:insideH w:val="single" w:sz="4" w:space="0" w:color="4472C4"/>
+              <w:insideV w:val="single" w:sz="4" w:space="0" w:color="4472C4"/>
+            </w:tcBorders>
+          </w:tcPr>
+          <w:p>
+            <w:pPr>
+              <w:jc w:val="left"/>
+            </w:pPr>
+            <w:r>
+              <w:rPr>
+                <w:sz w:val="17"/>
+              </w:rPr>
+              <w:t>Erdem K. &amp; Ömer F. Ş.</w:t>
             </w:r>
           </w:p>
         </w:tc>
       </w:tr>
     </w:tbl>
-    <w:p>
-      <w:pPr>
-        <w:rPr>
-          <w:color w:val="000000" w:themeColor="text1"/>
-        </w:rPr>
-      </w:pPr>
-    </w:p>
     <w:sectPr>
       <w:headerReference w:type="default" r:id="rId10"/>
       <w:footerReference w:type="default" r:id="rId11"/>

</xml_diff>